<commit_message>
Refine portfolio home and contact sections
</commit_message>
<xml_diff>
--- a/assets/documents/resumes/Thai_Nghiem_Public_CV_2026.docx
+++ b/assets/documents/resumes/Thai_Nghiem_Public_CV_2026.docx
@@ -462,7 +462,21 @@
           <w:sz w:val="20"/>
           <w:szCs w:val="28"/>
         </w:rPr>
-        <w:t>• Serve as a hands-on GenAI technical lead, architecting and prototyping agentic solutions using Python, FastAPI, React, GCP, Gemini, and Google ADK, with technical direction across APIs, data design, debugging, and deployment.</w:t>
+        <w:t xml:space="preserve">• Serve as a hands-on GenAI business analyst and technical lead, leading teams of up to 12 developers and </w:t>
+      </w:r>
+      <w:r>
+        <w:rPr>
+          <w:sz w:val="20"/>
+          <w:szCs w:val="28"/>
+        </w:rPr>
+        <w:t>a</w:t>
+      </w:r>
+      <w:r>
+        <w:rPr>
+          <w:sz w:val="20"/>
+          <w:szCs w:val="28"/>
+        </w:rPr>
+        <w:t xml:space="preserve"> business analysts while architecting and prototyping agentic solutions using Python, FastAPI, React, GCP, Gemini, and Google ADK.</w:t>
       </w:r>
     </w:p>
     <w:p>

</xml_diff>